<commit_message>
Generalize Task 2 knowledge reserve into prerequisite principles
Rewrite 知识储备 as domain knowledge for the task (datum and cleanliness,
motor install and calibration, fastening and moving harness, inspection)
instead of restating the five implementation steps.

Co-authored-by: FrankBooom <FrankBooom@users.noreply.github.com>
</commit_message>
<xml_diff>
--- a/docs/任务2-脚部支撑件与踝关节电机装配.docx
+++ b/docs/任务2-脚部支撑件与踝关节电机装配.docx
@@ -368,15 +368,15 @@
     </w:p>
     <w:p>
       <w:pPr>
-        <w:spacing w:before="160" w:after="80"/>
+        <w:spacing w:after="120" w:line="360" w:lineRule="auto"/>
       </w:pPr>
       <w:r>
         <w:rPr>
-          <w:rFonts w:ascii="黑体" w:hAnsi="黑体" w:eastAsia="黑体"/>
+          <w:rFonts w:ascii="宋体" w:hAnsi="宋体" w:eastAsia="宋体"/>
           <w:b/>
           <w:sz w:val="24"/>
         </w:rPr>
-        <w:t>工艺原则与装配基准</w:t>
+        <w:t>机械装配基准与清洁</w:t>
       </w:r>
     </w:p>
     <w:p>
@@ -389,7 +389,7 @@
           <w:b/>
           <w:sz w:val="24"/>
         </w:rPr>
-        <w:t>1.1 末端单元在整腿中的位置</w:t>
+        <w:t>1.1 配合面与装配基准</w:t>
       </w:r>
     </w:p>
     <w:p>
@@ -402,7 +402,7 @@
           <w:b w:val="0"/>
           <w:sz w:val="24"/>
         </w:rPr>
-        <w:t>本任务完成足端（脚部支撑底板—踝关节电机）预装，是任务1清点检验之后、任务3大小腿结构装配之前的单元装配。末端单元装不合格，后续小腿对接会把偏心、间隙和线束错误带入整腿，拆解成本高、还容易损伤配合面。学员应明确：本任务交出的是可转入小腿装配的合格足端模块，不是散件堆叠。</w:t>
+        <w:t>精密装配的精度首先取决于配合面。安装基准面的平面度、清洁度和贴合状态，决定轴心能否垂直、孔位能否自然对齐。基准不良时，后续紧固只会把倾斜和间隙锁死，不能靠加大扭矩纠正。凡构成同一配合链的表面，任一不合格，整组对位失效。</w:t>
       </w:r>
     </w:p>
     <w:p>
@@ -415,7 +415,7 @@
           <w:b/>
           <w:sz w:val="24"/>
         </w:rPr>
-        <w:t>1.2 清洁对位、分步紧固、先装后检</w:t>
+        <w:t>1.2 铝屑、油污、毛刺对装配的影响</w:t>
       </w:r>
     </w:p>
     <w:p>
@@ -428,7 +428,7 @@
           <w:b w:val="0"/>
           <w:sz w:val="24"/>
         </w:rPr>
-        <w:t>本任务工艺原则是「清洁对位、分步紧固、先装后检」。清洁对位指安装基准面必须去屑、去油、去毛刺，再进行轴心与孔位对正，否则后续紧固只会把倾斜锁死。分步紧固指电机螺栓不可一次拧死，须对角交叉、分次加力，使底板与法兰均匀贴合。先装后检指结构锁止和走线固定完成后，必须手动做俯仰、侧摆全行程验证，通过才可放行。三句话对应三条纪律：不清洁不对位、不交叉不锁死、不自检不转序。</w:t>
+        <w:t>金属切削残留以三种方式破坏装配：铝屑相当于局部垫高，造成单边倾斜；油污降低贴合摩擦，预紧后仍可能微移；毛刺阻碍贴合，脱落后进入转动副会引起卡滞或异响。清洁对象是所有进入配合链的表面，合格标准是无颗粒、无油膜、不划手、扣合无翘起。</w:t>
       </w:r>
     </w:p>
     <w:p>
@@ -441,7 +441,7 @@
           <w:b/>
           <w:sz w:val="24"/>
         </w:rPr>
-        <w:t>1.3 本任务物料与功用</w:t>
+        <w:t>1.3 清洁与对位的关系</w:t>
       </w:r>
     </w:p>
     <w:p>
@@ -454,7 +454,7 @@
           <w:b w:val="0"/>
           <w:sz w:val="24"/>
         </w:rPr>
-        <w:t>本任务物料为：螺柱、脚部支撑底板、踝关节旋转垫片、电机、腿部连接线，以及配套内六角螺栓、电机标定工具。脚部支撑底板是安装基体，决定足端平面与踝关节安装位；踝关节旋转垫片保证旋转面间隙与对中；电机提供踝关节驱动；螺柱与内六角螺栓完成法兰锁止；腿部连接线传输动力与信号；标定工具用于装配前确定电机零位基准。缺件、错件或垫片漏装，都会在自检中表现为卡滞、间隙或无法对孔。</w:t>
+        <w:t>对位是几何问题，清洁是对位成立的前提。带屑、带油时无法判断是否真正贴合，强行对孔会把杂质压入配合面。因此清洁必须在对位之前完成，而不是装配结束后补做。</w:t>
       </w:r>
     </w:p>
     <w:p>
@@ -467,7 +467,20 @@
           <w:b/>
           <w:sz w:val="24"/>
         </w:rPr>
-        <w:t>1.4 基准面清洁与杂质危害</w:t>
+        <w:t>关节电机安装与标定</w:t>
+      </w:r>
+    </w:p>
+    <w:p>
+      <w:pPr>
+        <w:spacing w:after="120" w:line="360" w:lineRule="auto"/>
+      </w:pPr>
+      <w:r>
+        <w:rPr>
+          <w:rFonts w:ascii="宋体" w:hAnsi="宋体" w:eastAsia="宋体"/>
+          <w:b/>
+          <w:sz w:val="24"/>
+        </w:rPr>
+        <w:t>2.1 型号、接口与力矩</w:t>
       </w:r>
     </w:p>
     <w:p>
@@ -480,20 +493,7 @@
           <w:b w:val="0"/>
           <w:sz w:val="24"/>
         </w:rPr>
-        <w:t>清洁对象是脚部支撑底板、防滑减震垫、踝关节旋转垫片。需去除铝屑、油污、毛刺。铝屑夹在法兰面会造成局部垫高、轴心倾斜；油污降低贴合摩擦，使预紧后仍可能微移；毛刺阻碍贴合，并可能掉入转动间隙。合格标准是安装基准面平整贴合：目视无颗粒、无油膜，手感不划手，零件扣合后无翘起。未清洁不得进入对位装配。</w:t>
-      </w:r>
-    </w:p>
-    <w:p>
-      <w:pPr>
-        <w:spacing w:before="160" w:after="80"/>
-      </w:pPr>
-      <w:r>
-        <w:rPr>
-          <w:rFonts w:ascii="黑体" w:hAnsi="黑体" w:eastAsia="黑体"/>
-          <w:b/>
-          <w:sz w:val="24"/>
-        </w:rPr>
-        <w:t>电机标定与对位装配</w:t>
+        <w:t>关节电机的型号对应机械接口、孔距、输出力矩和线束接头。型号不符会出现装不上、力矩不足或过载。装配前核对型号，是把电机的电气身份与机械位置对应起来，防止错轴流入后续工序。</w:t>
       </w:r>
     </w:p>
     <w:p>
@@ -506,7 +506,7 @@
           <w:b/>
           <w:sz w:val="24"/>
         </w:rPr>
-        <w:t>2.1 电机型号核对</w:t>
+        <w:t>2.2 标定与零位</w:t>
       </w:r>
     </w:p>
     <w:p>
@@ -519,7 +519,7 @@
           <w:b w:val="0"/>
           <w:sz w:val="24"/>
         </w:rPr>
-        <w:t>装配前必须核对电机型号与本工位踝关节要求一致。型号决定外形接口、孔距、力矩和线束接头。错装电机轻则孔位对不上、线束插不进，重则力矩不匹配或后续过载损坏。核对时应看铭牌或线标与工艺规定是否一致，确认是踝关节用电机、且左右腿归属正确后再标定。</w:t>
+        <w:t>标定的作用是把电机电气零位对准机械基准。未标定就锁入结构，后续零位复核缺少参照；法兰一旦紧固，补标通常要拆解。因此标定必须在结构锁死之前，使用配套工具完成。未标定视为不具备装配条件。</w:t>
       </w:r>
     </w:p>
     <w:p>
@@ -532,7 +532,7 @@
           <w:b/>
           <w:sz w:val="24"/>
         </w:rPr>
-        <w:t>2.2 电机标定</w:t>
+        <w:t>2.3 多关节装配顺序</w:t>
       </w:r>
     </w:p>
     <w:p>
@@ -545,7 +545,7 @@
           <w:b w:val="0"/>
           <w:sz w:val="24"/>
         </w:rPr>
-        <w:t>标定建立电机零位与控制基准。未标定电机装入结构后，后续转动测试与零位复核会失去机械参照；又因装配顺序一旦锁死，难以在机上补标。因此本任务要求：先标定、后装配。标定须使用配套电机标定工具，在电机尚未与底板锁死之前完成。未完成标定的电机禁止进入安装位。</w:t>
+        <w:t>多轴机器人的电机按轴序、接口方向和出线口安装，顺序构成整机运动学与布线约束。顺序或左右一旦装错，不能在后续工序局部修改，只能拆解重装，并可能损伤螺纹与垫片。这是不可逆约束，须在对位前确认。</w:t>
       </w:r>
     </w:p>
     <w:p>
@@ -558,7 +558,7 @@
           <w:b/>
           <w:sz w:val="24"/>
         </w:rPr>
-        <w:t>2.3 装配顺序不可改变</w:t>
+        <w:t>2.4 同轴、垂直与旋转垫片</w:t>
       </w:r>
     </w:p>
     <w:p>
@@ -571,7 +571,7 @@
           <w:b w:val="0"/>
           <w:sz w:val="24"/>
         </w:rPr>
-        <w:t>机器人关节电机按既定轴序和机械接口装配，顺序不可调换。踝关节电机一旦装入脚部支撑底板并紧固，位置与线束出口方向即被结构限定。错序或左右腿电机对调后，不能在后续工序“改一下”纠正，只能拆解重装，并可能损伤垫片与螺纹。学员必须在对位前确认：型号正确、标定完成、左右腿归属正确、装配顺序与工艺一致。</w:t>
+        <w:t>回转件安装的基本几何要求是：轴线相对安装面垂直，连接孔同轴对齐。不垂直会产生偏载和摆动干涉；错孔强拧会拉伤螺纹并锁入倾斜。旋转垫片用于保证转动面的间隙与对中，缺失、装反或变形会导致卡滞、异响或轴向窜动。螺栓应能垂直自由穿入、四周缝隙均匀，才允许进入紧固。</w:t>
       </w:r>
     </w:p>
     <w:p>
@@ -584,7 +584,20 @@
           <w:b/>
           <w:sz w:val="24"/>
         </w:rPr>
-        <w:t>2.4 电机—底板—垫片的装配顺序</w:t>
+        <w:t>螺纹紧固与运动线束</w:t>
+      </w:r>
+    </w:p>
+    <w:p>
+      <w:pPr>
+        <w:spacing w:after="120" w:line="360" w:lineRule="auto"/>
+      </w:pPr>
+      <w:r>
+        <w:rPr>
+          <w:rFonts w:ascii="宋体" w:hAnsi="宋体" w:eastAsia="宋体"/>
+          <w:b/>
+          <w:sz w:val="24"/>
+        </w:rPr>
+        <w:t>3.1 多螺栓均布紧固</w:t>
       </w:r>
     </w:p>
     <w:p>
@@ -597,7 +610,7 @@
           <w:b w:val="0"/>
           <w:sz w:val="24"/>
         </w:rPr>
-        <w:t>正确顺序是：先将踝关节电机对准脚部支撑底板安装位，再将踝关节旋转垫片放置在安装位。先放垫片再扣电机，容易使垫片偏移、遮孔或夹入铝屑；先对电机安装位，再放垫片，才能保证垫片处于旋转配合面的正确位置。三者关系是：底板定位置，电机定轴心，垫片定间隙与对中。垫片缺失、装反或损伤，会出现踝部卡滞、异响或轴向窜动。</w:t>
+        <w:t>均布螺栓的法兰若单边先拧死，板件会翻边，对角孔偏移，垫片局部压溃。对角交叉、分次加力，是为了让预紧沿圆周均匀建立。分步紧固解决的是受力均匀问题，不是简单“多拧几遍”。</w:t>
       </w:r>
     </w:p>
     <w:p>
@@ -610,7 +623,7 @@
           <w:b/>
           <w:sz w:val="24"/>
         </w:rPr>
-        <w:t>2.5 轴心垂直与孔位对齐</w:t>
+        <w:t>3.2 预紧过紧与过松</w:t>
       </w:r>
     </w:p>
     <w:p>
@@ -623,72 +636,7 @@
           <w:b w:val="0"/>
           <w:sz w:val="24"/>
         </w:rPr>
-        <w:t>轴心垂直指电机回转轴线相对底板安装面垂直。不垂直则俯仰、侧摆会出现偏摆、结构干涉或轴承偏载。孔位对齐指螺栓孔同轴对正后再穿装螺柱或内六角螺栓，禁止撬孔、错孔强拧。判断方法：目视四周缝隙均匀，螺栓能垂直自由穿入，垫片不被挤压变形。未对正不得进入分级紧固。</w:t>
-      </w:r>
-    </w:p>
-    <w:p>
-      <w:pPr>
-        <w:spacing w:before="160" w:after="80"/>
-      </w:pPr>
-      <w:r>
-        <w:rPr>
-          <w:rFonts w:ascii="黑体" w:hAnsi="黑体" w:eastAsia="黑体"/>
-          <w:b/>
-          <w:sz w:val="24"/>
-        </w:rPr>
-        <w:t>分级紧固与末端走线</w:t>
-      </w:r>
-    </w:p>
-    <w:p>
-      <w:pPr>
-        <w:spacing w:after="120" w:line="360" w:lineRule="auto"/>
-      </w:pPr>
-      <w:r>
-        <w:rPr>
-          <w:rFonts w:ascii="宋体" w:hAnsi="宋体" w:eastAsia="宋体"/>
-          <w:b/>
-          <w:sz w:val="24"/>
-        </w:rPr>
-        <w:t>3.1 对角交叉分次紧固</w:t>
-      </w:r>
-    </w:p>
-    <w:p>
-      <w:pPr>
-        <w:spacing w:after="120" w:line="360" w:lineRule="auto"/>
-      </w:pPr>
-      <w:r>
-        <w:rPr>
-          <w:rFonts w:ascii="宋体" w:hAnsi="宋体" w:eastAsia="宋体"/>
-          <w:b w:val="0"/>
-          <w:sz w:val="24"/>
-        </w:rPr>
-        <w:t>电机法兰多为多螺栓均布。若先把一侧拧死，底板会向该侧翻边，对角孔被拉偏，垫片局部压溃。对角交叉是先轻度预紧相对的两颗，再预紧另外两颗，然后按同一顺序分次加力，使贴合逐渐均匀，而不是一次锁死。分步紧固的目的是抵消单边先紧造成的倾斜。</w:t>
-      </w:r>
-    </w:p>
-    <w:p>
-      <w:pPr>
-        <w:spacing w:after="120" w:line="360" w:lineRule="auto"/>
-      </w:pPr>
-      <w:r>
-        <w:rPr>
-          <w:rFonts w:ascii="宋体" w:hAnsi="宋体" w:eastAsia="宋体"/>
-          <w:b/>
-          <w:sz w:val="24"/>
-        </w:rPr>
-        <w:t>3.2 扭矩过紧与过松</w:t>
-      </w:r>
-    </w:p>
-    <w:p>
-      <w:pPr>
-        <w:spacing w:after="120" w:line="360" w:lineRule="auto"/>
-      </w:pPr>
-      <w:r>
-        <w:rPr>
-          <w:rFonts w:ascii="宋体" w:hAnsi="宋体" w:eastAsia="宋体"/>
-          <w:b w:val="0"/>
-          <w:sz w:val="24"/>
-        </w:rPr>
-        <w:t>过紧会使脚部支撑底板或旋转垫片变形，螺纹滑丝，甚至把轴心拉斜；过松则配合面存在间隙，运动中出现松动、异响和螺栓退扣。均匀控制紧固扭矩，就是在「贴合无缝」和「不变形」之间取值。紧固后应再目视缝隙一周均匀、垫片无翻边、螺栓头露出高度基本一致。有变形或可见间隙，须松开后重新对位、交叉紧固，不得在歪斜状态下继续加力。</w:t>
+        <w:t>过紧导致薄壁件或垫片变形、滑丝、轴心被拉斜；过松导致配合面有间隙，运动中松动、异响、退扣。合格预紧落在贴合无缝与零件不变形之间。紧固后应检查一周缝隙、垫片状态和螺栓头部高度是否一致。歪斜状态下继续加力只会放大误差。</w:t>
       </w:r>
     </w:p>
     <w:p>
@@ -714,7 +662,7 @@
           <w:b w:val="0"/>
           <w:sz w:val="24"/>
         </w:rPr>
-        <w:t>踝关节电机同时引出动力线和信号线。动力线承载驱动电流，信号线传输编码器或通信信号。两类线须分别规整，避免缠绕、交叉挤压。接头方向与锁扣须与接口匹配。本任务以布置和固定为主，仍应避免带电插拔。线标不清或左右腿线束拿错，会在后续通电时造成插错轴或通信失败。</w:t>
+        <w:t>关节电机同时存在动力回路与反馈/通信回路。动力线传输驱动电流，信号线传输编码器或总线信号。两类线应分开规整，避免缠绕挤压；接头键位必须匹配。布置阶段保持断电，线标错误会在通电后表现为错轴或通信失败。</w:t>
       </w:r>
     </w:p>
     <w:p>
@@ -727,7 +675,7 @@
           <w:b/>
           <w:sz w:val="24"/>
         </w:rPr>
-        <w:t>3.4 行程余量与规避死角</w:t>
+        <w:t>3.4 运动余量与挤压死角</w:t>
       </w:r>
     </w:p>
     <w:p>
@@ -740,7 +688,7 @@
           <w:b w:val="0"/>
           <w:sz w:val="24"/>
         </w:rPr>
-        <w:t>踝关节有俯仰、侧摆两个运动。走线必须按全行程极限位置预留弯曲余量：把关节手动摆到两端极限，线束仍应松弛、不绷直、不拔接头。拉扯路径和结构夹缝是挤压死角，线束不得从锐边、螺栓头、转动剪切口穿过。固定后线束应能随关节运动，而不滑移到干涉区。极限位拉扯是线束失效的主要原因。</w:t>
+        <w:t>有相对运动的关节，线束必须按极限位置预留弯曲余量。静态整齐不等于运动合格：摆到行程两端仍应松弛、不拔接头，并避开锐边、螺栓头和转动剪切口。极限位拉扯是线束失效的主要原因，走线是否合格要用运动来验证。</w:t>
       </w:r>
     </w:p>
     <w:p>
@@ -753,7 +701,7 @@
           <w:b/>
           <w:sz w:val="24"/>
         </w:rPr>
-        <w:t>3.5 左右腿走线差异</w:t>
+        <w:t>3.5 双足结构的左右线束差异</w:t>
       </w:r>
     </w:p>
     <w:p>
@@ -766,20 +714,7 @@
           <w:b w:val="0"/>
           <w:sz w:val="24"/>
         </w:rPr>
-        <w:t>左右腿线路不可混装。差异点是：左腿有接入头部的线路，右腿无。走线前先确认当前是左足端还是右足端，再核对线束有无头部支线。把左腿线束装到右腿，会出现多余线无处固定、后续整机插接混乱；把右腿线束装到左腿，头部通道缺失，后续无法接线。左右标识必须在固定前完成核对。</w:t>
-      </w:r>
-    </w:p>
-    <w:p>
-      <w:pPr>
-        <w:spacing w:before="160" w:after="80"/>
-      </w:pPr>
-      <w:r>
-        <w:rPr>
-          <w:rFonts w:ascii="黑体" w:hAnsi="黑体" w:eastAsia="黑体"/>
-          <w:b/>
-          <w:sz w:val="24"/>
-        </w:rPr>
-        <w:t>自检判定与安全交接</w:t>
+        <w:t>双足机器人左右结构镜像，线束却常常不对称。本任务中左腿有接入头部的线路，右腿无。走线前先辨左右，再核对接头与支线数量。混装的结果是多余线无法固定，或头部通道缺失，后续整机无法正确插接。</w:t>
       </w:r>
     </w:p>
     <w:p>
@@ -792,7 +727,20 @@
           <w:b/>
           <w:sz w:val="24"/>
         </w:rPr>
-        <w:t>4.1 俯仰与侧摆全行程</w:t>
+        <w:t>装配检验与安全</w:t>
+      </w:r>
+    </w:p>
+    <w:p>
+      <w:pPr>
+        <w:spacing w:after="120" w:line="360" w:lineRule="auto"/>
+      </w:pPr>
+      <w:r>
+        <w:rPr>
+          <w:rFonts w:ascii="宋体" w:hAnsi="宋体" w:eastAsia="宋体"/>
+          <w:b/>
+          <w:sz w:val="24"/>
+        </w:rPr>
+        <w:t>4.1 全行程、全自由度检验</w:t>
       </w:r>
     </w:p>
     <w:p>
@@ -805,7 +753,7 @@
           <w:b w:val="0"/>
           <w:sz w:val="24"/>
         </w:rPr>
-        <w:t>踝关节自检必须覆盖两个自由度的全行程，而不是只摆一下中位。俯仰对应脚尖点地与脚背抬起方向，侧摆对应足面内翻与外翻方向。只测一个方向，无法发现垫片偏磨、螺栓干涉，或线束在另一极限被拉紧。自检应在紧固完成、走线固定之后进行，使结构状态与交付状态一致。</w:t>
+        <w:t>单元装配后的检验对象是该关节的全部自由度及其全行程，而不是中位手感。踝关节一般包含俯仰与侧摆。漏测一个方向，就可能漏掉该极限上的干涉或线束绷紧。检验应在紧固和走线都完成后进行，使检验状态与交付状态一致。</w:t>
       </w:r>
     </w:p>
     <w:p>
@@ -818,7 +766,7 @@
           <w:b/>
           <w:sz w:val="24"/>
         </w:rPr>
-        <w:t>4.2 干涉、卡顿、异响的判定</w:t>
+        <w:t>4.2 干涉、卡顿、异响</w:t>
       </w:r>
     </w:p>
     <w:p>
@@ -831,7 +779,7 @@
           <w:b w:val="0"/>
           <w:sz w:val="24"/>
         </w:rPr>
-        <w:t>结构干涉：运动中零件相碰、垫片刮擦、螺栓头碰到运动件。卡顿：某角度阻力突然增大或咬死。异响：金属刮擦、撞击或间隙碰撞声。三者任一出现即判本单元不合格，须拆检清洁、对位、扭矩和走线，不得带病转序。合格表现是全程阻力均匀、无碰擦、无突变、无线束绷紧。</w:t>
+        <w:t>干涉指运动件相碰；卡顿指阻力在某角度突变或咬死；异响指刮擦、撞击或间隙碰撞。三者都是装配缺陷的外在表现，任一出现即不合格，须回到基准、对位、预紧或走线查找原因。合格表现为全程阻力均匀、无碰擦、无突变。</w:t>
       </w:r>
     </w:p>
     <w:p>
@@ -844,7 +792,7 @@
           <w:b/>
           <w:sz w:val="24"/>
         </w:rPr>
-        <w:t>4.3 手动摆动安全</w:t>
+        <w:t>4.3 断电手动检验</w:t>
       </w:r>
     </w:p>
     <w:p>
@@ -857,7 +805,7 @@
           <w:b w:val="0"/>
           <w:sz w:val="24"/>
         </w:rPr>
-        <w:t>自检在断电、不驱动条件下进行，用手匀速摆动足端，禁止通电点动代替本环节。手指避开转动剪切口以及底板与电机之间的夹缝。发现卡死不得用力猛扳，应停手检查垫片、螺栓和线束。手转时握足板外沿，保持关节在可控范围内运动。</w:t>
+        <w:t>结构未确认前不得通电点动。手动匀速摆动用于暴露机械干涉和线束拉扯，不用于检查控制参数。操作时避开剪切口与夹缝，遇卡死不得猛扳。</w:t>
       </w:r>
     </w:p>
     <w:p>
@@ -870,7 +818,7 @@
           <w:b/>
           <w:sz w:val="24"/>
         </w:rPr>
-        <w:t>4.4 与后续工序的交接标准</w:t>
+        <w:t>4.4 转序条件</w:t>
       </w:r>
     </w:p>
     <w:p>
@@ -883,7 +831,7 @@
           <w:b w:val="0"/>
           <w:sz w:val="24"/>
         </w:rPr>
-        <w:t>本任务结束时应同时满足：基准面清洁且贴合；电机已核对型号并完成标定，装配顺序正确；轴心垂直、孔位对齐、对角紧固均匀；左右腿线束布置正确并已预留行程余量；俯仰、侧摆全行程无干涉、无卡顿、无异响。只有这一状态，才具备进入「大小腿结构装配」的条件。</w:t>
+        <w:t>转入下一工序前，装配单元应同时满足：配合面清洁贴合；电机身份与标定正确；几何对位与预紧均匀；线束左右正确且有运动余量；全行程无干涉、无卡顿、无异响。不满足则不具备进入后续结构装配的条件。</w:t>
       </w:r>
     </w:p>
     <w:p>

</xml_diff>